<commit_message>
se arregla repo x2
</commit_message>
<xml_diff>
--- a/fase1/individuales/GUTIERREZ_PABLO_1.3_APT122_AutoevaluacionFase1.docx
+++ b/fase1/individuales/GUTIERREZ_PABLO_1.3_APT122_AutoevaluacionFase1.docx
@@ -140,7 +140,7 @@
           <w:sz w:val="34"/>
           <w:szCs w:val="34"/>
         </w:rPr>
-        <w:t xml:space="preserve"> Una nueva forma de Pagar</w:t>
+        <w:t xml:space="preserve"> POS móvil de DTemite — vender, cobrar, emitir DTE</w:t>
       </w:r>
     </w:p>
     <w:p>
@@ -1379,15 +1379,15 @@
           <w:sz w:val="22"/>
           <w:szCs w:val="22"/>
         </w:rPr>
-        <w:t xml:space="preserve"> y consiste en la evolución del sistema de punto de venta móvil D-PAY, actualmente en producción, desde una arquitectura de pagos dependiente de hardware de terminal (TUU/Kozen) hacia un modelo de pasarelas de pago extensible y desacoplado. El aporte técnico central es el diseño e implementación de una arquitectura </w:t>
-      </w:r>
-      <w:proofErr w:type="spellStart"/>
-      <w:r>
-        <w:rPr>
-          <w:sz w:val="22"/>
-          <w:szCs w:val="22"/>
-        </w:rPr>
-        <w:t>multi-gateway</w:t>
+        <w:t xml:space="preserve"> y consiste en diseñar y desarrollar D-PAY como POS móvil completo de DTemite: vender, cobrar y emitir DTE desde el celular, integrado a la plataforma cloud multi-tenant de la empresa. El aporte técnico central es el diseño e implementación de una arquitectura </w:t>
+      </w:r>
+      <w:proofErr w:type="spellStart"/>
+      <w:r>
+        <w:rPr>
+          <w:sz w:val="22"/>
+          <w:szCs w:val="22"/>
+        </w:rPr>
+        <w:t>POS completo</w:t>
       </w:r>
       <w:proofErr w:type="spellEnd"/>
       <w:r>
@@ -1828,7 +1828,7 @@
           <w:sz w:val="22"/>
           <w:szCs w:val="22"/>
         </w:rPr>
-        <w:t>multi-gateway</w:t>
+        <w:t>POS completo</w:t>
       </w:r>
       <w:proofErr w:type="spellEnd"/>
       <w:r>
@@ -2004,7 +2004,7 @@
           <w:sz w:val="22"/>
           <w:szCs w:val="22"/>
         </w:rPr>
-        <w:t>PaymentGateway</w:t>
+        <w:t>Payment Hub / flujos POS</w:t>
       </w:r>
       <w:proofErr w:type="spellEnd"/>
       <w:r>
@@ -3256,7 +3256,7 @@
           <w:sz w:val="22"/>
           <w:szCs w:val="22"/>
         </w:rPr>
-        <w:t>PaymentGateway</w:t>
+        <w:t>Payment Hub / flujos POS</w:t>
       </w:r>
       <w:proofErr w:type="spellEnd"/>
       <w:r>
@@ -3301,7 +3301,7 @@
           <w:sz w:val="22"/>
           <w:szCs w:val="22"/>
         </w:rPr>
-        <w:t xml:space="preserve"> Backlog para etapas posteriores. El equipo de desarrollo está compuesto por Diego Madrid, Pablo Gutiérrez y Reinhard Munzenmayer.</w:t>
+        <w:t xml:space="preserve"> Backlog para etapas posteriores. El equipo está compuesto por Diego Madrid (desarrollo), Pablo Gutiérrez (arquitectura/Scrum Master) y Reinhartd Munzenmayer (QA/documentación).</w:t>
       </w:r>
     </w:p>
     <w:p>
@@ -3467,7 +3467,7 @@
           <w:sz w:val="22"/>
           <w:szCs w:val="22"/>
         </w:rPr>
-        <w:t>PaymentGateway</w:t>
+        <w:t>Payment Hub / flujos POS</w:t>
       </w:r>
       <w:proofErr w:type="spellEnd"/>
       <w:r>
@@ -3578,7 +3578,7 @@
           <w:sz w:val="22"/>
           <w:szCs w:val="22"/>
         </w:rPr>
-        <w:t>PaymentGateway</w:t>
+        <w:t>Payment Hub / flujos POS</w:t>
       </w:r>
       <w:proofErr w:type="spellEnd"/>
       <w:r>
@@ -3609,7 +3609,7 @@
           <w:sz w:val="22"/>
           <w:szCs w:val="22"/>
         </w:rPr>
-        <w:t>Realizar pruebas de certificación tanto de los productos como de los procesos utilizando buenas prácticas definidas por la industria. Debo diseñar y ejecutar pruebas funcionales del flujo Webpay (HU-06): pago aprobado, rechazado y error de conexión, con evidencia (casos de prueba, logs o capturas) y registro de defectos. En Fase 1 esta competencia se evidencia en la planificación; su aplicación completa corresponde a la Fase 2.</w:t>
+        <w:t>Realizar pruebas de certificación tanto de los productos como de los procesos utilizando buenas prácticas definidas por la industria. Debo diseñar y ejecutar pruebas funcionales del flujo POS completo (HU-14): login, venta, efectivo, TUU, DTE, historial e impresión, con matriz de casos, capturas y video demo. En Fase 1 esta competencia se evidencia en la planificación; su aplicación completa corresponde a la Fase 2.</w:t>
       </w:r>
     </w:p>
     <w:p>
@@ -3950,7 +3950,7 @@
           <w:sz w:val="22"/>
           <w:szCs w:val="22"/>
         </w:rPr>
-        <w:t>PaymentGateway</w:t>
+        <w:t>Payment Hub / flujos POS</w:t>
       </w:r>
       <w:proofErr w:type="spellEnd"/>
       <w:r>
@@ -4474,7 +4474,7 @@
           <w:sz w:val="22"/>
           <w:szCs w:val="22"/>
         </w:rPr>
-        <w:t>PaymentGateway</w:t>
+        <w:t>Payment Hub / flujos POS</w:t>
       </w:r>
       <w:proofErr w:type="spellEnd"/>
       <w:r>
@@ -4569,7 +4569,7 @@
           <w:sz w:val="22"/>
           <w:szCs w:val="22"/>
         </w:rPr>
-        <w:t>Diseñar e implementar una arquitectura de pagos extensible para el sistema D-PAY, que permita incorporar múltiples pasarelas de pago digitales de forma desacoplada, utilizando Webpay como implementación mínima viable durante el semestre.</w:t>
+        <w:t>Diseñar y desarrollar D-PAY, el POS móvil de DTemite, para que un comercio autenticado venda, cobre y emita DTE desde un dispositivo Android, integrado a la plataforma cloud de la empresa.</w:t>
       </w:r>
     </w:p>
     <w:p>
@@ -4760,7 +4760,7 @@
           <w:sz w:val="22"/>
           <w:szCs w:val="22"/>
         </w:rPr>
-        <w:t>PaymentGateway</w:t>
+        <w:t>Payment Hub / flujos POS</w:t>
       </w:r>
       <w:proofErr w:type="spellEnd"/>
       <w:r>
@@ -5058,7 +5058,7 @@
           <w:sz w:val="22"/>
           <w:szCs w:val="22"/>
         </w:rPr>
-        <w:t xml:space="preserve"> Backlog priorizado (Historias de Usuario HU-01 a HU-08), del cual se desprenden los </w:t>
+        <w:t xml:space="preserve"> Backlog priorizado (Historias de Usuario HU-01 a HU-14 del producto POS), del cual se desprenden los </w:t>
       </w:r>
       <w:proofErr w:type="spellStart"/>
       <w:r>
@@ -5854,7 +5854,7 @@
           <w:sz w:val="22"/>
           <w:szCs w:val="22"/>
         </w:rPr>
-        <w:t>PaymentGateway</w:t>
+        <w:t>Payment Hub / flujos POS</w:t>
       </w:r>
       <w:proofErr w:type="spellEnd"/>
       <w:r>
@@ -6526,7 +6526,7 @@
           <w:sz w:val="22"/>
           <w:szCs w:val="22"/>
         </w:rPr>
-        <w:t>PaymentGateway</w:t>
+        <w:t>Payment Hub / flujos POS</w:t>
       </w:r>
       <w:proofErr w:type="spellEnd"/>
       <w:r>
@@ -10790,7 +10790,7 @@
           <w:sz w:val="22"/>
           <w:szCs w:val="22"/>
         </w:rPr>
-        <w:t>PaymentGateway</w:t>
+        <w:t>Payment Hub / flujos POS</w:t>
       </w:r>
       <w:proofErr w:type="spellEnd"/>
       <w:r>

</xml_diff>